<commit_message>
Clean resume contact header
</commit_message>
<xml_diff>
--- a/Chandana_Resume_Same_Format_Updated.docx
+++ b/Chandana_Resume_Same_Format_Updated.docx
@@ -37,27 +37,6 @@
           <w:bottom w:val="single" w:sz="8" w:space="4" w:color="D9E2EC"/>
         </w:pBdr>
       </w:pPr>
-      <w:r/>
-      <w:hyperlink r:id="rId9">
-        <w:r>
-          <w:rPr>
-            <w:color w:val="1F4E79"/>
-            <w:u w:val="single"/>
-          </w:rPr>
-          <w:t>LinkedIn</w:t>
-        </w:r>
-      </w:hyperlink>
-      <w:r/>
-      <w:hyperlink r:id="rId10">
-        <w:r>
-          <w:rPr>
-            <w:color w:val="1F4E79"/>
-            <w:u w:val="single"/>
-          </w:rPr>
-          <w:t>GitHub</w:t>
-        </w:r>
-      </w:hyperlink>
-      <w:r/>
       <w:r>
         <w:t xml:space="preserve">Bangalore  |  chanduzz9568@gmail.com  |  +91 6363186470  |  </w:t>
       </w:r>
@@ -85,7 +64,7 @@
       <w:r>
         <w:t xml:space="preserve">  |  </w:t>
       </w:r>
-      <w:hyperlink r:id="rId22">
+      <w:hyperlink r:id="rId11">
         <w:r>
           <w:rPr>
             <w:color w:val="1F4E79"/>
@@ -158,7 +137,7 @@
       <w:r>
         <w:t xml:space="preserve"> | </w:t>
       </w:r>
-      <w:hyperlink r:id="rId23">
+      <w:hyperlink r:id="rId12">
         <w:r>
           <w:rPr>
             <w:color w:val="1F4E79"/>
@@ -170,7 +149,7 @@
       <w:r>
         <w:t xml:space="preserve"> | </w:t>
       </w:r>
-      <w:hyperlink r:id="rId22">
+      <w:hyperlink r:id="rId11">
         <w:r>
           <w:rPr>
             <w:color w:val="1F4E79"/>
@@ -213,7 +192,7 @@
       <w:r>
         <w:t xml:space="preserve"> | </w:t>
       </w:r>
-      <w:hyperlink r:id="rId11">
+      <w:hyperlink r:id="rId13">
         <w:r>
           <w:rPr>
             <w:color w:val="1F4E79"/>
@@ -225,7 +204,7 @@
       <w:r>
         <w:t xml:space="preserve"> | </w:t>
       </w:r>
-      <w:hyperlink r:id="rId12">
+      <w:hyperlink r:id="rId14">
         <w:r>
           <w:rPr>
             <w:color w:val="1F4E79"/>
@@ -268,7 +247,7 @@
       <w:r>
         <w:t xml:space="preserve"> | </w:t>
       </w:r>
-      <w:hyperlink r:id="rId13">
+      <w:hyperlink r:id="rId15">
         <w:r>
           <w:rPr>
             <w:color w:val="1F4E79"/>
@@ -280,7 +259,7 @@
       <w:r>
         <w:t xml:space="preserve"> | </w:t>
       </w:r>
-      <w:hyperlink r:id="rId14">
+      <w:hyperlink r:id="rId16">
         <w:r>
           <w:rPr>
             <w:color w:val="1F4E79"/>
@@ -323,7 +302,7 @@
       <w:r>
         <w:t xml:space="preserve"> | </w:t>
       </w:r>
-      <w:hyperlink r:id="rId15">
+      <w:hyperlink r:id="rId17">
         <w:r>
           <w:rPr>
             <w:color w:val="1F4E79"/>
@@ -335,7 +314,7 @@
       <w:r>
         <w:t xml:space="preserve"> | </w:t>
       </w:r>
-      <w:hyperlink r:id="rId16">
+      <w:hyperlink r:id="rId18">
         <w:r>
           <w:rPr>
             <w:color w:val="1F4E79"/>
@@ -378,7 +357,7 @@
       <w:r>
         <w:t xml:space="preserve"> | </w:t>
       </w:r>
-      <w:hyperlink r:id="rId17">
+      <w:hyperlink r:id="rId19">
         <w:r>
           <w:rPr>
             <w:color w:val="1F4E79"/>
@@ -390,7 +369,7 @@
       <w:r>
         <w:t xml:space="preserve"> | </w:t>
       </w:r>
-      <w:hyperlink r:id="rId18">
+      <w:hyperlink r:id="rId20">
         <w:r>
           <w:rPr>
             <w:color w:val="1F4E79"/>
@@ -433,7 +412,7 @@
       <w:r>
         <w:t xml:space="preserve"> | </w:t>
       </w:r>
-      <w:hyperlink r:id="rId19">
+      <w:hyperlink r:id="rId21">
         <w:r>
           <w:rPr>
             <w:color w:val="1F4E79"/>
@@ -445,7 +424,7 @@
       <w:r>
         <w:t xml:space="preserve"> | </w:t>
       </w:r>
-      <w:hyperlink r:id="rId20">
+      <w:hyperlink r:id="rId22">
         <w:r>
           <w:rPr>
             <w:color w:val="1F4E79"/>
@@ -656,7 +635,7 @@
         <w:t>Volunteer Coordinator</w:t>
       </w:r>
       <w:r>
-        <w:t xml:space="preserve"> | Avisa Charitable Trust | Bangalore, </w:t>
+        <w:t xml:space="preserve"> | Avisa Charitable Trust | Bangalore</w:t>
       </w:r>
     </w:p>
     <w:p>
@@ -745,7 +724,7 @@
       </w:r>
     </w:p>
     <w:sectPr>
-      <w:footerReference w:type="default" r:id="rId21"/>
+      <w:footerReference w:type="default" r:id="rId23"/>
       <w:pgSz w:w="12240" w:h="15840"/>
       <w:pgMar w:top="648" w:right="792" w:bottom="648" w:left="792" w:header="720" w:footer="720" w:gutter="0"/>
       <w:cols w:space="720"/>

</xml_diff>

<commit_message>
Set exact resume contact line
</commit_message>
<xml_diff>
--- a/Chandana_Resume_Same_Format_Updated.docx
+++ b/Chandana_Resume_Same_Format_Updated.docx
@@ -38,7 +38,7 @@
         </w:pBdr>
       </w:pPr>
       <w:r>
-        <w:t xml:space="preserve">Bangalore  |  chanduzz9568@gmail.com  |  +91 6363186470  |  </w:t>
+        <w:t xml:space="preserve">Bangalore | chanduzz9568@gmail.com | +91 6363186470 | </w:t>
       </w:r>
       <w:hyperlink r:id="rId9">
         <w:r>
@@ -50,7 +50,7 @@
         </w:r>
       </w:hyperlink>
       <w:r>
-        <w:t xml:space="preserve">  |  </w:t>
+        <w:t xml:space="preserve"> | </w:t>
       </w:r>
       <w:hyperlink r:id="rId10">
         <w:r>
@@ -62,7 +62,7 @@
         </w:r>
       </w:hyperlink>
       <w:r>
-        <w:t xml:space="preserve">  |  </w:t>
+        <w:t xml:space="preserve"> | </w:t>
       </w:r>
       <w:hyperlink r:id="rId11">
         <w:r>

</xml_diff>